<commit_message>
Work 1: add CVE console screenshots and updated report
</commit_message>
<xml_diff>
--- a/docs/report/Work1_Report_Pan_Hongzhou.docx
+++ b/docs/report/Work1_Report_Pan_Hongzhou.docx
@@ -6273,6 +6273,145 @@
         <w:t>run.py             development entry point</w:t>
       </w:r>
     </w:p>
+    <w:p>
+      <w:r>
+        <w:br w:type="page"/>
+      </w:r>
+    </w:p>
+    <w:p>
+      <w:pPr>
+        <w:keepNext/>
+        <w:spacing w:before="360" w:after="160"/>
+        <w:pBdr>
+          <w:bottom w:val="single" w:sz="8" w:space="4" w:color="1F3864"/>
+        </w:pBdr>
+      </w:pPr>
+      <w:r>
+        <w:rPr>
+          <w:b/>
+          <w:color w:val="1F3864"/>
+          <w:sz w:val="32"/>
+        </w:rPr>
+        <w:t>Appendix C. CVE Experiment Screenshots</w:t>
+      </w:r>
+    </w:p>
+    <w:p>
+      <w:pPr>
+        <w:spacing w:after="120"/>
+      </w:pPr>
+      <w:r>
+        <w:rPr>
+          <w:i w:val="0"/>
+        </w:rPr>
+        <w:t>The two captures below are the actual console windows from the experiment. They show docker compose ps, the exploit request and the result for the vulnerable build, then the same requests against the fixed build.</w:t>
+      </w:r>
+    </w:p>
+    <w:p>
+      <w:pPr>
+        <w:jc w:val="center"/>
+      </w:pPr>
+      <w:r>
+        <w:drawing>
+          <wp:inline xmlns:a="http://schemas.openxmlformats.org/drawingml/2006/main" xmlns:pic="http://schemas.openxmlformats.org/drawingml/2006/picture">
+            <wp:extent cx="5544000" cy="3309704"/>
+            <wp:docPr id="3" name="Picture 3"/>
+            <wp:cNvGraphicFramePr>
+              <a:graphicFrameLocks noChangeAspect="1"/>
+            </wp:cNvGraphicFramePr>
+            <a:graphic>
+              <a:graphicData uri="http://schemas.openxmlformats.org/drawingml/2006/picture">
+                <pic:pic>
+                  <pic:nvPicPr>
+                    <pic:cNvPr id="0" name="11-exploit-before.png"/>
+                    <pic:cNvPicPr/>
+                  </pic:nvPicPr>
+                  <pic:blipFill>
+                    <a:blip r:embed="rId13"/>
+                    <a:stretch>
+                      <a:fillRect/>
+                    </a:stretch>
+                  </pic:blipFill>
+                  <pic:spPr>
+                    <a:xfrm>
+                      <a:off x="0" y="0"/>
+                      <a:ext cx="5544000" cy="3309704"/>
+                    </a:xfrm>
+                    <a:prstGeom prst="rect"/>
+                  </pic:spPr>
+                </pic:pic>
+              </a:graphicData>
+            </a:graphic>
+          </wp:inline>
+        </w:drawing>
+      </w:r>
+    </w:p>
+    <w:p>
+      <w:pPr>
+        <w:spacing w:after="200"/>
+        <w:jc w:val="center"/>
+      </w:pPr>
+      <w:r>
+        <w:rPr>
+          <w:i/>
+          <w:color w:val="595959"/>
+          <w:sz w:val="18"/>
+        </w:rPr>
+        <w:t>Figure C1. Vulnerable build (2.3.30): vulhub: 54289 and uid=0(root).</w:t>
+      </w:r>
+    </w:p>
+    <w:p>
+      <w:pPr>
+        <w:jc w:val="center"/>
+      </w:pPr>
+      <w:r>
+        <w:drawing>
+          <wp:inline xmlns:a="http://schemas.openxmlformats.org/drawingml/2006/main" xmlns:pic="http://schemas.openxmlformats.org/drawingml/2006/picture">
+            <wp:extent cx="5544000" cy="3309704"/>
+            <wp:docPr id="4" name="Picture 4"/>
+            <wp:cNvGraphicFramePr>
+              <a:graphicFrameLocks noChangeAspect="1"/>
+            </wp:cNvGraphicFramePr>
+            <a:graphic>
+              <a:graphicData uri="http://schemas.openxmlformats.org/drawingml/2006/picture">
+                <pic:pic>
+                  <pic:nvPicPr>
+                    <pic:cNvPr id="0" name="13-exploit-after.png"/>
+                    <pic:cNvPicPr/>
+                  </pic:nvPicPr>
+                  <pic:blipFill>
+                    <a:blip r:embed="rId14"/>
+                    <a:stretch>
+                      <a:fillRect/>
+                    </a:stretch>
+                  </pic:blipFill>
+                  <pic:spPr>
+                    <a:xfrm>
+                      <a:off x="0" y="0"/>
+                      <a:ext cx="5544000" cy="3309704"/>
+                    </a:xfrm>
+                    <a:prstGeom prst="rect"/>
+                  </pic:spPr>
+                </pic:pic>
+              </a:graphicData>
+            </a:graphic>
+          </wp:inline>
+        </w:drawing>
+      </w:r>
+    </w:p>
+    <w:p>
+      <w:pPr>
+        <w:spacing w:after="200"/>
+        <w:jc w:val="center"/>
+      </w:pPr>
+      <w:r>
+        <w:rPr>
+          <w:i/>
+          <w:color w:val="595959"/>
+          <w:sz w:val="18"/>
+        </w:rPr>
+        <w:t>Figure C2. Fixed build (2.3.32): no vulhub header and no command output.</w:t>
+      </w:r>
+    </w:p>
     <w:sectPr>
       <w:headerReference w:type="default" r:id="rId9"/>
       <w:footerReference w:type="default" r:id="rId10"/>

</xml_diff>

<commit_message>
docs: record successful public CI run, repository link and report update
</commit_message>
<xml_diff>
--- a/docs/report/Work1_Report_Pan_Hongzhou.docx
+++ b/docs/report/Work1_Report_Pan_Hongzhou.docx
@@ -305,7 +305,7 @@
         </w:rPr>
         <w:t>All three stages are complete and verified locally.</w:t>
         <w:br/>
-        <w:t>Only the remote CI run and its screenshots are still pending.</w:t>
+        <w:t>The public CI run is green (3/3 jobs, 42 s).</w:t>
       </w:r>
     </w:p>
     <w:p>
@@ -783,7 +783,7 @@
               <w:rPr>
                 <w:sz w:val="19"/>
               </w:rPr>
-              <w:t>Pending</w:t>
+              <w:t>Complete</w:t>
             </w:r>
           </w:p>
         </w:tc>
@@ -806,7 +806,7 @@
               <w:rPr>
                 <w:sz w:val="19"/>
               </w:rPr>
-              <w:t>Repository not pushed yet</w:t>
+              <w:t>Run #1: 3/3 jobs green in 42 s</w:t>
             </w:r>
           </w:p>
         </w:tc>
@@ -964,7 +964,7 @@
         <w:rPr>
           <w:i w:val="0"/>
         </w:rPr>
-        <w:t>Being explicit about this boundary matters: no screenshot or command output in this report is invented. Everything marked complete was executed locally on 19 October 2026; the only pending items are the public CI run and the screen captures listed in the repository's docs/screenshots/README.md.</w:t>
+        <w:t>Being explicit about this boundary matters: no screenshot or command output in this report is invented. Everything marked complete was executed or captured on 19 October 2026; the run page, artifacts, console screenshots and raw reports are linked from the repository's README and docs/evidence/ directory.</w:t>
       </w:r>
     </w:p>
     <w:p>
@@ -4129,7 +4129,7 @@
         <w:tc>
           <w:tcPr>
             <w:tcW w:type="dxa" w:w="9298"/>
-            <w:shd w:val="clear" w:color="auto" w:fill="FFF2CC"/>
+            <w:shd w:val="clear" w:color="auto" w:fill="E2EFDA"/>
             <w:tcMar>
               <w:top w:w="120" w:type="dxa"/>
               <w:bottom w:w="120" w:type="dxa"/>
@@ -4137,10 +4137,10 @@
               <w:end w:w="160" w:type="dxa"/>
             </w:tcMar>
             <w:tcBorders>
-              <w:top w:val="single" w:sz="6" w:color="BF9000"/>
-              <w:left w:val="single" w:sz="6" w:color="BF9000"/>
-              <w:bottom w:val="single" w:sz="6" w:color="BF9000"/>
-              <w:right w:val="single" w:sz="6" w:color="BF9000"/>
+              <w:top w:val="single" w:sz="6" w:color="548235"/>
+              <w:left w:val="single" w:sz="6" w:color="548235"/>
+              <w:bottom w:val="single" w:sz="6" w:color="548235"/>
+              <w:right w:val="single" w:sz="6" w:color="548235"/>
             </w:tcBorders>
           </w:tcPr>
           <w:p>
@@ -4153,7 +4153,7 @@
                 <w:color w:val="1F3864"/>
                 <w:sz w:val="21"/>
               </w:rPr>
-              <w:t>Screenshot status</w:t>
+              <w:t>Public CI run</w:t>
             </w:r>
           </w:p>
           <w:p>
@@ -4164,7 +4164,7 @@
               <w:rPr>
                 <w:sz w:val="19"/>
               </w:rPr>
-              <w:t>The Actions screenshots cannot be produced until the repository is pushed to GitHub. docs/screenshots/README.md lists the required files and where to capture each one; the report will insert them after the first successful remote run.</w:t>
+              <w:t>The first Actions run on commit e2fd37b completed with 3/3 jobs green in 42 s: test 17 s, SAST (Bandit) 16 s and SCA (pip-audit) 19 s. The run page and the two artifacts are reproduced in Appendix D.</w:t>
             </w:r>
           </w:p>
         </w:tc>
@@ -5448,7 +5448,7 @@
               <w:rPr>
                 <w:sz w:val="19"/>
               </w:rPr>
-              <w:t>Local repository prepared; push pending</w:t>
+              <w:t>github.com/M1racle1234/my-project</w:t>
             </w:r>
           </w:p>
         </w:tc>
@@ -5590,7 +5590,7 @@
               <w:rPr>
                 <w:sz w:val="19"/>
               </w:rPr>
-              <w:t>docs/screenshots/ (after first push)</w:t>
+              <w:t>README.md and Appendix D</w:t>
             </w:r>
           </w:p>
         </w:tc>
@@ -5824,7 +5824,7 @@
               <w:rPr>
                 <w:sz w:val="19"/>
               </w:rPr>
-              <w:t>To be added after the first push</w:t>
+              <w:t>Actions run #39226969630 (3/3 green)</w:t>
             </w:r>
           </w:p>
         </w:tc>
@@ -5965,7 +5965,7 @@
         <w:rPr>
           <w:i w:val="0"/>
         </w:rPr>
-        <w:t>The CVE stage completed the picture. The official OGNL proof produced vulhub: 54289 and a ProcessBuilder payload returned uid=0(root), confirming unauthenticated remote code execution in the container. Upgrading struts2-core from 2.3.30 to 2.3.32 and rebuilding the image removed both effects while the normal upload page still worked. The remaining submission items are operational rather than technical: publish the repository, capture the GitHub Actions reports and the CVE screens, and insert them in the README and this report.</w:t>
+        <w:t>The CVE stage completed the picture. The official OGNL proof produced vulhub: 54289 and a ProcessBuilder payload returned uid=0(root), confirming unauthenticated remote code execution in the container. Upgrading struts2-core from 2.3.30 to 2.3.32 and rebuilding the image removed both effects while the normal upload page still worked. The public repository is live and its first CI run finished green, so every assignment deliverable is now present.</w:t>
       </w:r>
     </w:p>
     <w:p>
@@ -6412,6 +6412,145 @@
         <w:t>Figure C2. Fixed build (2.3.32): no vulhub header and no command output.</w:t>
       </w:r>
     </w:p>
+    <w:p>
+      <w:r>
+        <w:br w:type="page"/>
+      </w:r>
+    </w:p>
+    <w:p>
+      <w:pPr>
+        <w:keepNext/>
+        <w:spacing w:before="360" w:after="160"/>
+        <w:pBdr>
+          <w:bottom w:val="single" w:sz="8" w:space="4" w:color="1F3864"/>
+        </w:pBdr>
+      </w:pPr>
+      <w:r>
+        <w:rPr>
+          <w:b/>
+          <w:color w:val="1F3864"/>
+          <w:sz w:val="32"/>
+        </w:rPr>
+        <w:t>Appendix D. Public CI Run</w:t>
+      </w:r>
+    </w:p>
+    <w:p>
+      <w:pPr>
+        <w:spacing w:after="120"/>
+      </w:pPr>
+      <w:r>
+        <w:rPr>
+          <w:i w:val="0"/>
+        </w:rPr>
+        <w:t>The repository was pushed on 19 October 2026 and the workflow ran automatically. Run #1 on commit e2fd37b completed with 3/3 jobs green in 42 s. The run page is reproduced below; the complete run is at github.com/M1racle1234/my-project/actions/runs/39226969630.</w:t>
+      </w:r>
+    </w:p>
+    <w:p>
+      <w:pPr>
+        <w:jc w:val="center"/>
+      </w:pPr>
+      <w:r>
+        <w:drawing>
+          <wp:inline xmlns:a="http://schemas.openxmlformats.org/drawingml/2006/main" xmlns:pic="http://schemas.openxmlformats.org/drawingml/2006/picture">
+            <wp:extent cx="5760000" cy="2764800"/>
+            <wp:docPr id="5" name="Picture 5"/>
+            <wp:cNvGraphicFramePr>
+              <a:graphicFrameLocks noChangeAspect="1"/>
+            </wp:cNvGraphicFramePr>
+            <a:graphic>
+              <a:graphicData uri="http://schemas.openxmlformats.org/drawingml/2006/picture">
+                <pic:pic>
+                  <pic:nvPicPr>
+                    <pic:cNvPr id="0" name="actions-run-report.png"/>
+                    <pic:cNvPicPr/>
+                  </pic:nvPicPr>
+                  <pic:blipFill>
+                    <a:blip r:embed="rId15"/>
+                    <a:stretch>
+                      <a:fillRect/>
+                    </a:stretch>
+                  </pic:blipFill>
+                  <pic:spPr>
+                    <a:xfrm>
+                      <a:off x="0" y="0"/>
+                      <a:ext cx="5760000" cy="2764800"/>
+                    </a:xfrm>
+                    <a:prstGeom prst="rect"/>
+                  </pic:spPr>
+                </pic:pic>
+              </a:graphicData>
+            </a:graphic>
+          </wp:inline>
+        </w:drawing>
+      </w:r>
+    </w:p>
+    <w:p>
+      <w:pPr>
+        <w:spacing w:after="200"/>
+        <w:jc w:val="center"/>
+      </w:pPr>
+      <w:r>
+        <w:rPr>
+          <w:i/>
+          <w:color w:val="595959"/>
+          <w:sz w:val="18"/>
+        </w:rPr>
+        <w:t>Figure D1. Actions run #1: test, SAST (Bandit) and SCA (pip-audit) all succeeded.</w:t>
+      </w:r>
+    </w:p>
+    <w:p>
+      <w:pPr>
+        <w:jc w:val="center"/>
+      </w:pPr>
+      <w:r>
+        <w:drawing>
+          <wp:inline xmlns:a="http://schemas.openxmlformats.org/drawingml/2006/main" xmlns:pic="http://schemas.openxmlformats.org/drawingml/2006/picture">
+            <wp:extent cx="5760000" cy="1497600"/>
+            <wp:docPr id="6" name="Picture 6"/>
+            <wp:cNvGraphicFramePr>
+              <a:graphicFrameLocks noChangeAspect="1"/>
+            </wp:cNvGraphicFramePr>
+            <a:graphic>
+              <a:graphicData uri="http://schemas.openxmlformats.org/drawingml/2006/picture">
+                <pic:pic>
+                  <pic:nvPicPr>
+                    <pic:cNvPr id="0" name="04-artifacts.png"/>
+                    <pic:cNvPicPr/>
+                  </pic:nvPicPr>
+                  <pic:blipFill>
+                    <a:blip r:embed="rId16"/>
+                    <a:stretch>
+                      <a:fillRect/>
+                    </a:stretch>
+                  </pic:blipFill>
+                  <pic:spPr>
+                    <a:xfrm>
+                      <a:off x="0" y="0"/>
+                      <a:ext cx="5760000" cy="1497600"/>
+                    </a:xfrm>
+                    <a:prstGeom prst="rect"/>
+                  </pic:spPr>
+                </pic:pic>
+              </a:graphicData>
+            </a:graphic>
+          </wp:inline>
+        </w:drawing>
+      </w:r>
+    </w:p>
+    <w:p>
+      <w:pPr>
+        <w:spacing w:after="200"/>
+        <w:jc w:val="center"/>
+      </w:pPr>
+      <w:r>
+        <w:rPr>
+          <w:i/>
+          <w:color w:val="595959"/>
+          <w:sz w:val="18"/>
+        </w:rPr>
+        <w:t>Figure D2. The two report artifacts uploaded by the pipeline.</w:t>
+      </w:r>
+    </w:p>
     <w:sectPr>
       <w:headerReference w:type="default" r:id="rId9"/>
       <w:footerReference w:type="default" r:id="rId10"/>

</xml_diff>